<commit_message>
pyspark in azure databricks
</commit_message>
<xml_diff>
--- a/June15th/Azure Devops.docx
+++ b/June15th/Azure Devops.docx
@@ -4,21 +4,13 @@
   <w:body>
     <w:p>
       <w:r>
-        <w:t xml:space="preserve">Cloud computing is the on-demand delivery of computing </w:t>
-      </w:r>
-      <w:proofErr w:type="gramStart"/>
-      <w:r>
-        <w:t>services</w:t>
+        <w:t>Cloud computing is the on-demand delivery of computing services</w:t>
       </w:r>
       <w:r>
         <w:t xml:space="preserve">  </w:t>
       </w:r>
       <w:r>
-        <w:t>including</w:t>
-      </w:r>
-      <w:proofErr w:type="gramEnd"/>
-      <w:r>
-        <w:t xml:space="preserve"> servers, storage, databases, networking, and software</w:t>
+        <w:t>including servers, storage, databases, networking, and software</w:t>
       </w:r>
       <w:r>
         <w:t xml:space="preserve"> </w:t>
@@ -164,21 +156,112 @@
     </w:p>
     <w:p>
       <w:r>
-        <w:t xml:space="preserve">IaaS provides the foundational building blocks of </w:t>
-      </w:r>
-      <w:proofErr w:type="gramStart"/>
-      <w:r>
-        <w:t>computing</w:t>
-      </w:r>
-      <w:r>
-        <w:t xml:space="preserve">  -</w:t>
-      </w:r>
-      <w:proofErr w:type="gramEnd"/>
-      <w:r>
+        <w:t>IaaS provides the foundational building blocks of computing</w:t>
+      </w:r>
+      <w:r>
+        <w:t xml:space="preserve">  - </w:t>
+      </w:r>
+      <w:r>
+        <w:t xml:space="preserve">virtual servers, storage, and networking. </w:t>
+      </w:r>
+    </w:p>
+    <w:p>
+      <w:pPr>
+        <w:rPr>
+          <w:b/>
+          <w:bCs/>
+        </w:rPr>
+      </w:pPr>
+      <w:r>
+        <w:rPr>
+          <w:b/>
+          <w:bCs/>
+        </w:rPr>
+        <w:t>PaaS (Platform as a Service)</w:t>
+      </w:r>
+    </w:p>
+    <w:p>
+      <w:r>
+        <w:t>PaaS provides a complete, managed cloud environment so developers can build, test, and deploy software without managing the underlying servers or databases</w:t>
+      </w:r>
+    </w:p>
+    <w:p>
+      <w:pPr>
+        <w:rPr>
+          <w:b/>
+          <w:bCs/>
+        </w:rPr>
+      </w:pPr>
+      <w:r>
+        <w:rPr>
+          <w:b/>
+          <w:bCs/>
+        </w:rPr>
+        <w:t>SaaS (Software as a Service)</w:t>
+      </w:r>
+    </w:p>
+    <w:p>
+      <w:r>
+        <w:t xml:space="preserve">SaaS delivers fully functional, ready-to-use software applications over the internet on a subscription basis. </w:t>
+      </w:r>
+    </w:p>
+    <w:p/>
+    <w:p>
+      <w:pPr>
+        <w:rPr>
+          <w:b/>
+          <w:bCs/>
+        </w:rPr>
+      </w:pPr>
+      <w:r>
+        <w:rPr>
+          <w:b/>
+          <w:bCs/>
+        </w:rPr>
+        <w:t>What is</w:t>
+      </w:r>
+      <w:r>
+        <w:rPr>
+          <w:b/>
+          <w:bCs/>
+        </w:rPr>
+        <w:t xml:space="preserve"> Azure</w:t>
+      </w:r>
+      <w:r>
+        <w:rPr>
+          <w:b/>
+          <w:bCs/>
+        </w:rPr>
         <w:t xml:space="preserve"> </w:t>
       </w:r>
-      <w:r>
-        <w:t xml:space="preserve">virtual servers, storage, and networking. </w:t>
+      <w:proofErr w:type="spellStart"/>
+      <w:r>
+        <w:rPr>
+          <w:b/>
+          <w:bCs/>
+        </w:rPr>
+        <w:t>DataBricks</w:t>
+      </w:r>
+      <w:proofErr w:type="spellEnd"/>
+      <w:r>
+        <w:rPr>
+          <w:b/>
+          <w:bCs/>
+        </w:rPr>
+        <w:t>?</w:t>
+      </w:r>
+    </w:p>
+    <w:p>
+      <w:r>
+        <w:t>Databricks is a cloud-based Data Intelligence platform designed to unify data engineering, data science, machine learning, and business analytics into a single collaborative system</w:t>
+      </w:r>
+      <w:r>
+        <w:t xml:space="preserve"> </w:t>
+      </w:r>
+    </w:p>
+    <w:p>
+      <w:r>
+        <w:t>Azure Databricks is a cloud-based data analytics and AI platform built through a partnership between Microsoft Azure and Databricks</w:t>
       </w:r>
     </w:p>
     <w:p>
@@ -193,12 +276,44 @@
           <w:b/>
           <w:bCs/>
         </w:rPr>
-        <w:t>PaaS (Platform as a Service)</w:t>
-      </w:r>
-    </w:p>
-    <w:p>
-      <w:r>
-        <w:t>PaaS provides a complete, managed cloud environment so developers can build, test, and deploy software without managing the underlying servers or databases</w:t>
+        <w:t>What is the advantage of Using Azure Databricks?</w:t>
+      </w:r>
+      <w:r>
+        <w:rPr>
+          <w:b/>
+          <w:bCs/>
+        </w:rPr>
+        <w:t>\</w:t>
+      </w:r>
+    </w:p>
+    <w:p>
+      <w:r>
+        <w:t xml:space="preserve">Fast Big Data processing </w:t>
+      </w:r>
+    </w:p>
+    <w:p>
+      <w:r>
+        <w:t xml:space="preserve">Unified platform </w:t>
+      </w:r>
+    </w:p>
+    <w:p>
+      <w:r>
+        <w:t>Easy integration w azure services</w:t>
+      </w:r>
+    </w:p>
+    <w:p>
+      <w:r>
+        <w:t xml:space="preserve">Supports multiple programming language </w:t>
+      </w:r>
+    </w:p>
+    <w:p>
+      <w:r>
+        <w:t xml:space="preserve">Built in Machine Learning Support </w:t>
+      </w:r>
+    </w:p>
+    <w:p>
+      <w:r>
+        <w:t xml:space="preserve">Scalability </w:t>
       </w:r>
     </w:p>
     <w:p>
@@ -213,12 +328,285 @@
           <w:b/>
           <w:bCs/>
         </w:rPr>
-        <w:t>SaaS (Software as a Service)</w:t>
-      </w:r>
-    </w:p>
-    <w:p>
-      <w:r>
-        <w:t xml:space="preserve">SaaS delivers fully functional, ready-to-use software applications over the internet on a subscription basis. </w:t>
+        <w:t xml:space="preserve">What is a work space? </w:t>
+      </w:r>
+    </w:p>
+    <w:p>
+      <w:pPr>
+        <w:rPr>
+          <w:b/>
+          <w:bCs/>
+        </w:rPr>
+      </w:pPr>
+      <w:r>
+        <w:t>A workspace is the main environment where users work in Azure Databricks.</w:t>
+      </w:r>
+      <w:r>
+        <w:br/>
+      </w:r>
+    </w:p>
+    <w:p>
+      <w:pPr>
+        <w:rPr>
+          <w:b/>
+          <w:bCs/>
+        </w:rPr>
+      </w:pPr>
+    </w:p>
+    <w:p>
+      <w:pPr>
+        <w:rPr>
+          <w:b/>
+          <w:bCs/>
+        </w:rPr>
+      </w:pPr>
+    </w:p>
+    <w:p>
+      <w:r>
+        <w:rPr>
+          <w:b/>
+          <w:bCs/>
+        </w:rPr>
+        <w:lastRenderedPageBreak/>
+        <w:t>What is EDA?</w:t>
+      </w:r>
+      <w:r>
+        <w:t xml:space="preserve"> </w:t>
+      </w:r>
+    </w:p>
+    <w:p>
+      <w:r>
+        <w:t>process of understanding and investigating data before building reports or machine learning models.</w:t>
+      </w:r>
+    </w:p>
+    <w:p>
+      <w:r>
+        <w:t xml:space="preserve">Like Data Inspection = </w:t>
+      </w:r>
+      <w:proofErr w:type="spellStart"/>
+      <w:r>
+        <w:t>wqhat</w:t>
+      </w:r>
+      <w:proofErr w:type="spellEnd"/>
+      <w:r>
+        <w:t xml:space="preserve"> is </w:t>
+      </w:r>
+      <w:proofErr w:type="spellStart"/>
+      <w:r>
+        <w:t>their</w:t>
+      </w:r>
+      <w:proofErr w:type="spellEnd"/>
+      <w:r>
+        <w:t xml:space="preserve"> in the data </w:t>
+      </w:r>
+    </w:p>
+    <w:p>
+      <w:r>
+        <w:t xml:space="preserve">Missing value analysis </w:t>
+      </w:r>
+    </w:p>
+    <w:p>
+      <w:r>
+        <w:t xml:space="preserve">Distribution = how the data is distributed </w:t>
+      </w:r>
+    </w:p>
+    <w:p>
+      <w:r>
+        <w:t xml:space="preserve">Outlier detection = find if </w:t>
+      </w:r>
+      <w:proofErr w:type="spellStart"/>
+      <w:r>
+        <w:t>theres</w:t>
+      </w:r>
+      <w:proofErr w:type="spellEnd"/>
+      <w:r>
+        <w:t xml:space="preserve"> any noise in the data</w:t>
+      </w:r>
+    </w:p>
+    <w:p>
+      <w:pPr>
+        <w:pBdr>
+          <w:bottom w:val="single" w:sz="6" w:space="1" w:color="auto"/>
+        </w:pBdr>
+      </w:pPr>
+      <w:r>
+        <w:t xml:space="preserve">Correlation analysis = Relationship between Variables </w:t>
+      </w:r>
+    </w:p>
+    <w:p>
+      <w:r>
+        <w:t>Scalable &amp; Elastic</w:t>
+      </w:r>
+    </w:p>
+    <w:p>
+      <w:proofErr w:type="spellStart"/>
+      <w:r>
+        <w:t>TaxSmile</w:t>
+      </w:r>
+      <w:proofErr w:type="spellEnd"/>
+      <w:r>
+        <w:t xml:space="preserve"> -- IT Returns Portal -- On Prem Solution -- 2 Servers -- Feb -- In Apr Increase in Traffic</w:t>
+      </w:r>
+      <w:r>
+        <w:br/>
+        <w:t>Load Testing and Stress Testing -- 3 More Servers  -- 5 Months</w:t>
+      </w:r>
+    </w:p>
+    <w:p>
+      <w:r>
+        <w:t>1. Get Approvals from the Stake Holders -- CEO, CTO, Directors</w:t>
+      </w:r>
+    </w:p>
+    <w:p>
+      <w:r>
+        <w:t>2. Procure / Buy the Servers -- Germany -- 2 weeks</w:t>
+      </w:r>
+    </w:p>
+    <w:p>
+      <w:r>
+        <w:t>3. Retrofit the Servers in Server Room -- Network Eng -- 24/7 -- 3 Teams + 1 Team</w:t>
+      </w:r>
+    </w:p>
+    <w:p>
+      <w:r>
+        <w:t>4. Power Supply</w:t>
+      </w:r>
+    </w:p>
+    <w:p>
+      <w:pPr>
+        <w:pBdr>
+          <w:bottom w:val="single" w:sz="6" w:space="1" w:color="auto"/>
+        </w:pBdr>
+      </w:pPr>
+      <w:r>
+        <w:t>5. Rent for the Server Room</w:t>
+      </w:r>
+    </w:p>
+    <w:p>
+      <w:pPr>
+        <w:pBdr>
+          <w:bottom w:val="single" w:sz="6" w:space="1" w:color="auto"/>
+        </w:pBdr>
+      </w:pPr>
+    </w:p>
+    <w:p>
+      <w:pPr>
+        <w:pBdr>
+          <w:bottom w:val="single" w:sz="6" w:space="1" w:color="auto"/>
+        </w:pBdr>
+      </w:pPr>
+      <w:r>
+        <w:t>Imagine if we are doing a project with our own in premise server that costs a lot of time and money, like we need approval for any change in the server, people to manage those server, power supply, rent for room and many such – this  is the main disadvantage of on premise server</w:t>
+      </w:r>
+    </w:p>
+    <w:p/>
+    <w:p>
+      <w:proofErr w:type="spellStart"/>
+      <w:r>
+        <w:t>TaxSmile</w:t>
+      </w:r>
+      <w:proofErr w:type="spellEnd"/>
+      <w:r>
+        <w:t xml:space="preserve"> -- IT Returns Portal -- Azure Cloud Solution</w:t>
+      </w:r>
+    </w:p>
+    <w:p>
+      <w:r>
+        <w:t>Text Box -- 5 -- Save -- 2 mins -- 5 Server Cluster</w:t>
+      </w:r>
+    </w:p>
+    <w:p>
+      <w:r>
+        <w:t xml:space="preserve">Increasing the servers -- Scaling </w:t>
+      </w:r>
+      <w:r>
+        <w:t>–</w:t>
+      </w:r>
+      <w:r>
+        <w:t xml:space="preserve"> Elastic</w:t>
+      </w:r>
+    </w:p>
+    <w:p>
+      <w:r>
+        <w:t xml:space="preserve">But in case of cloud server we can do a change in server in minutes by just changing a value or a text in the azure portal  </w:t>
+      </w:r>
+    </w:p>
+    <w:p>
+      <w:r>
+        <w:t xml:space="preserve"> </w:t>
+      </w:r>
+      <w:r>
+        <w:t>---</w:t>
+      </w:r>
+    </w:p>
+    <w:p>
+      <w:r>
+        <w:lastRenderedPageBreak/>
+        <w:drawing>
+          <wp:inline distT="0" distB="0" distL="0" distR="0" wp14:anchorId="22322E8C" wp14:editId="1B301528">
+            <wp:extent cx="5943600" cy="4129405"/>
+            <wp:effectExtent l="0" t="0" r="0" b="4445"/>
+            <wp:docPr id="343956922" name="Picture 1"/>
+            <wp:cNvGraphicFramePr>
+              <a:graphicFrameLocks xmlns:a="http://schemas.openxmlformats.org/drawingml/2006/main" noChangeAspect="1"/>
+            </wp:cNvGraphicFramePr>
+            <a:graphic xmlns:a="http://schemas.openxmlformats.org/drawingml/2006/main">
+              <a:graphicData uri="http://schemas.openxmlformats.org/drawingml/2006/picture">
+                <pic:pic xmlns:pic="http://schemas.openxmlformats.org/drawingml/2006/picture">
+                  <pic:nvPicPr>
+                    <pic:cNvPr id="343956922" name=""/>
+                    <pic:cNvPicPr/>
+                  </pic:nvPicPr>
+                  <pic:blipFill>
+                    <a:blip r:embed="rId5"/>
+                    <a:stretch>
+                      <a:fillRect/>
+                    </a:stretch>
+                  </pic:blipFill>
+                  <pic:spPr>
+                    <a:xfrm>
+                      <a:off x="0" y="0"/>
+                      <a:ext cx="5943600" cy="4129405"/>
+                    </a:xfrm>
+                    <a:prstGeom prst="rect">
+                      <a:avLst/>
+                    </a:prstGeom>
+                  </pic:spPr>
+                </pic:pic>
+              </a:graphicData>
+            </a:graphic>
+          </wp:inline>
+        </w:drawing>
+      </w:r>
+    </w:p>
+    <w:p>
+      <w:r>
+        <w:t>Azure Portal, CLI, PowerShell, and SDKs send requests through Azure APIs.</w:t>
+      </w:r>
+    </w:p>
+    <w:p>
+      <w:r>
+        <w:t>Azure Resource Manager (ARM) is the management layer that receives and processes these requests.</w:t>
+      </w:r>
+    </w:p>
+    <w:p>
+      <w:r>
+        <w:t>Orchestrator coordinates and automates resource deployment in the correct order.</w:t>
+      </w:r>
+    </w:p>
+    <w:p>
+      <w:r>
+        <w:t>Fabric Controller manages the underlying physical infrastructure (servers, storage, and networking).</w:t>
+      </w:r>
+    </w:p>
+    <w:p>
+      <w:pPr>
+        <w:rPr>
+          <w:b/>
+        </w:rPr>
+      </w:pPr>
+      <w:r>
+        <w:t>Multiple Fabric Controllers provide scalability and fault tolerance.</w:t>
       </w:r>
     </w:p>
     <w:sectPr>

</xml_diff>